<commit_message>
Remove firm name from 57th GST Council brief (logo to be added separately)
Co-Authored-By: Claude Sonnet 5.5 <noreply@anthropic.com>
Claude-Session: https://claude.ai/code/session_01Qjt6wrV3HfmQ2eGZnnMMF8
</commit_message>
<xml_diff>
--- a/out/57th-GST-Council-Brief.docx
+++ b/out/57th-GST-Council-Brief.docx
@@ -49,7 +49,7 @@
                 <w:sz w:val="15"/>
                 <w:szCs w:val="15"/>
               </w:rPr>
-              <w:t xml:space="preserve">SVSG &amp; ASSOCIATES  |  INDIRECT TAX BRIEF</w:t>
+              <w:t xml:space="preserve">INDIRECT TAX BRIEF</w:t>
             </w:r>
           </w:p>
           <w:p>
@@ -13583,7 +13583,7 @@
         <w:sz w:val="15"/>
         <w:szCs w:val="15"/>
       </w:rPr>
-      <w:t xml:space="preserve">SVSG &amp; Associates  |  57th GST Council: recommendations only, not legal advice</w:t>
+      <w:t xml:space="preserve">57th GST Council: recommendations only, not legal advice</w:t>
     </w:r>
     <w:r>
       <w:rPr>

</xml_diff>

<commit_message>
Add logo and update tagline on 57th GST Council brief
Co-Authored-By: Claude Sonnet 5.5 <noreply@anthropic.com>
Claude-Session: https://claude.ai/code/session_01Qjt6wrV3HfmQ2eGZnnMMF8
</commit_message>
<xml_diff>
--- a/out/57th-GST-Council-Brief.docx
+++ b/out/57th-GST-Council-Brief.docx
@@ -2,6 +2,51 @@
 <file path=word/document.xml><?xml version="1.0" encoding="utf-8"?>
 <w:document xmlns:wpc="http://schemas.microsoft.com/office/word/2010/wordprocessingCanvas" xmlns:mc="http://schemas.openxmlformats.org/markup-compatibility/2006" xmlns:o="urn:schemas-microsoft-com:office:office" xmlns:r="http://schemas.openxmlformats.org/officeDocument/2006/relationships" xmlns:m="http://schemas.openxmlformats.org/officeDocument/2006/math" xmlns:v="urn:schemas-microsoft-com:vml" xmlns:wp14="http://schemas.microsoft.com/office/word/2010/wordprocessingDrawing" xmlns:wp="http://schemas.openxmlformats.org/drawingml/2006/wordprocessingDrawing" xmlns:w10="urn:schemas-microsoft-com:office:word" xmlns:w="http://schemas.openxmlformats.org/wordprocessingml/2006/main" xmlns:w14="http://schemas.microsoft.com/office/word/2010/wordml" xmlns:w15="http://schemas.microsoft.com/office/word/2012/wordml" xmlns:wpg="http://schemas.microsoft.com/office/word/2010/wordprocessingGroup" xmlns:wpi="http://schemas.microsoft.com/office/word/2010/wordprocessingInk" xmlns:wne="http://schemas.microsoft.com/office/word/2006/wordml" xmlns:wps="http://schemas.microsoft.com/office/word/2010/wordprocessingShape" xmlns:cx="http://schemas.microsoft.com/office/drawing/2014/chartex" xmlns:cx1="http://schemas.microsoft.com/office/drawing/2015/9/8/chartex" xmlns:cx2="http://schemas.microsoft.com/office/drawing/2015/10/21/chartex" xmlns:cx3="http://schemas.microsoft.com/office/drawing/2016/5/9/chartex" xmlns:cx4="http://schemas.microsoft.com/office/drawing/2016/5/10/chartex" xmlns:cx5="http://schemas.microsoft.com/office/drawing/2016/5/11/chartex" xmlns:cx6="http://schemas.microsoft.com/office/drawing/2016/5/12/chartex" xmlns:cx7="http://schemas.microsoft.com/office/drawing/2016/5/13/chartex" xmlns:cx8="http://schemas.microsoft.com/office/drawing/2016/5/14/chartex" xmlns:aink="http://schemas.microsoft.com/office/drawing/2016/ink" xmlns:am3d="http://schemas.microsoft.com/office/drawing/2017/model3d" xmlns:w16cex="http://schemas.microsoft.com/office/word/2018/wordml/cex" xmlns:w16cid="http://schemas.microsoft.com/office/word/2016/wordml/cid" xmlns:w16="http://schemas.microsoft.com/office/word/2018/wordml" xmlns:w16sdtdh="http://schemas.microsoft.com/office/word/2020/wordml/sdtdatahash" xmlns:w16se="http://schemas.microsoft.com/office/word/2015/wordml/symex" mc:Ignorable="w14 w15 wp14">
   <w:body>
+    <w:p>
+      <w:pPr>
+        <w:spacing w:after="100"/>
+      </w:pPr>
+      <w:r>
+        <w:drawing>
+          <wp:inline distT="0" distB="0" distL="0" distR="0">
+            <wp:extent cx="2857500" cy="552450"/>
+            <wp:effectExtent t="0" r="0" b="0" l="0"/>
+            <wp:docPr id="1" name="logo" descr="SVSG &amp; Associates logo" title="Logo"/>
+            <wp:cNvGraphicFramePr>
+              <a:graphicFrameLocks xmlns:a="http://schemas.openxmlformats.org/drawingml/2006/main" noChangeAspect="1"/>
+            </wp:cNvGraphicFramePr>
+            <a:graphic xmlns:a="http://schemas.openxmlformats.org/drawingml/2006/main">
+              <a:graphicData uri="http://schemas.openxmlformats.org/drawingml/2006/picture">
+                <pic:pic xmlns:pic="http://schemas.openxmlformats.org/drawingml/2006/picture">
+                  <pic:nvPicPr>
+                    <pic:cNvPr id="0" name="" descr=""/>
+                    <pic:cNvPicPr>
+                      <a:picLocks noChangeAspect="1" noChangeArrowheads="1"/>
+                    </pic:cNvPicPr>
+                  </pic:nvPicPr>
+                  <pic:blipFill>
+                    <a:blip r:embed="rId8" cstate="none"/>
+                    <a:srcRect/>
+                    <a:stretch>
+                      <a:fillRect/>
+                    </a:stretch>
+                  </pic:blipFill>
+                  <pic:spPr bwMode="auto">
+                    <a:xfrm>
+                      <a:off x="0" y="0"/>
+                      <a:ext cx="2857500" cy="552450"/>
+                    </a:xfrm>
+                    <a:prstGeom prst="rect">
+                      <a:avLst/>
+                    </a:prstGeom>
+                  </pic:spPr>
+                </pic:pic>
+              </a:graphicData>
+            </a:graphic>
+          </wp:inline>
+        </w:drawing>
+      </w:r>
+    </w:p>
     <w:tbl>
       <w:tblPr>
         <w:tblW w:type="dxa" w:w="9890"/>
@@ -79,7 +124,7 @@
                 <w:sz w:val="19"/>
                 <w:szCs w:val="19"/>
               </w:rPr>
-              <w:t xml:space="preserve">No slab changed. How GST is policed, refunded and fought did.   |   Held 8 October 2026, New Delhi</w:t>
+              <w:t xml:space="preserve">No slab changed. How GST is policed, refunded and fought is being rewritten.   |   Held 8 October 2026, New Delhi</w:t>
             </w:r>
           </w:p>
         </w:tc>

</xml_diff>

<commit_message>
Smaller header logo on page 1 and small logo in every page footer
Co-Authored-By: Claude Sonnet 5.5 <noreply@anthropic.com>
Claude-Session: https://claude.ai/code/session_01Qjt6wrV3HfmQ2eGZnnMMF8
</commit_message>
<xml_diff>
--- a/out/57th-GST-Council-Brief.docx
+++ b/out/57th-GST-Council-Brief.docx
@@ -10,7 +10,7 @@
       <w:r>
         <w:drawing>
           <wp:inline distT="0" distB="0" distL="0" distR="0">
-            <wp:extent cx="2857500" cy="552450"/>
+            <wp:extent cx="1809750" cy="352425"/>
             <wp:effectExtent t="0" r="0" b="0" l="0"/>
             <wp:docPr id="1" name="logo" descr="SVSG &amp; Associates logo" title="Logo"/>
             <wp:cNvGraphicFramePr>
@@ -35,7 +35,7 @@
                   <pic:spPr bwMode="auto">
                     <a:xfrm>
                       <a:off x="0" y="0"/>
-                      <a:ext cx="2857500" cy="552450"/>
+                      <a:ext cx="1809750" cy="352425"/>
                     </a:xfrm>
                     <a:prstGeom prst="rect">
                       <a:avLst/>
@@ -13673,6 +13673,54 @@
       <w:fldChar w:fldCharType="separate"/>
       <w:fldChar w:fldCharType="end"/>
     </w:r>
+    <w:r>
+      <w:rPr>
+        <w:rFonts w:ascii="Calibri" w:cs="Calibri" w:eastAsia="Calibri" w:hAnsi="Calibri"/>
+        <w:sz w:val="15"/>
+        <w:szCs w:val="15"/>
+      </w:rPr>
+      <w:t xml:space="preserve">   </w:t>
+    </w:r>
+    <w:r>
+      <w:drawing>
+        <wp:inline distT="0" distB="0" distL="0" distR="0">
+          <wp:extent cx="1143000" cy="219075"/>
+          <wp:effectExtent t="0" r="0" b="0" l="0"/>
+          <wp:docPr id="1" name="footer-logo" descr="SVSG &amp; Associates logo" title="Logo"/>
+          <wp:cNvGraphicFramePr>
+            <a:graphicFrameLocks xmlns:a="http://schemas.openxmlformats.org/drawingml/2006/main" noChangeAspect="1"/>
+          </wp:cNvGraphicFramePr>
+          <a:graphic xmlns:a="http://schemas.openxmlformats.org/drawingml/2006/main">
+            <a:graphicData uri="http://schemas.openxmlformats.org/drawingml/2006/picture">
+              <pic:pic xmlns:pic="http://schemas.openxmlformats.org/drawingml/2006/picture">
+                <pic:nvPicPr>
+                  <pic:cNvPr id="0" name="" descr=""/>
+                  <pic:cNvPicPr>
+                    <a:picLocks noChangeAspect="1" noChangeArrowheads="1"/>
+                  </pic:cNvPicPr>
+                </pic:nvPicPr>
+                <pic:blipFill>
+                  <a:blip r:embed="rId0" cstate="none"/>
+                  <a:srcRect/>
+                  <a:stretch>
+                    <a:fillRect/>
+                  </a:stretch>
+                </pic:blipFill>
+                <pic:spPr bwMode="auto">
+                  <a:xfrm>
+                    <a:off x="0" y="0"/>
+                    <a:ext cx="1143000" cy="219075"/>
+                  </a:xfrm>
+                  <a:prstGeom prst="rect">
+                    <a:avLst/>
+                  </a:prstGeom>
+                </pic:spPr>
+              </pic:pic>
+            </a:graphicData>
+          </a:graphic>
+        </wp:inline>
+      </w:drawing>
+    </w:r>
   </w:p>
 </w:ftr>
 </file>

</xml_diff>